<commit_message>
Add all 24 lesson plans (MD & DOCX)
</commit_message>
<xml_diff>
--- a/lesson-plans/lessonplan_pertemuan15.docx
+++ b/lesson-plans/lessonplan_pertemuan15.docx
@@ -179,9 +179,28 @@
             <w:vAlign w:val="center"/>
           </w:tcPr>
           <w:p>
+            <w:pPr>
+              <w:spacing w:before="60" w:after="60"/>
+              <w:rPr>
+                <w:rFonts w:ascii="Tahoma" w:eastAsia="Tahoma" w:hAnsi="Tahoma" w:cs="Tahoma"/>
+                <w:b/>
+                <w:sz w:val="22"/>
+                <w:szCs w:val="22"/>
+                <w:lang w:val="en-US"/>
+              </w:rPr>
+            </w:pPr>
+            <w:proofErr w:type="spellStart"/>
             <w:r>
+              <w:rPr>
+                <w:rFonts w:ascii="Tahoma" w:eastAsia="Tahoma" w:hAnsi="Tahoma" w:cs="Tahoma"/>
+                <w:b/>
+                <w:sz w:val="22"/>
+                <w:szCs w:val="22"/>
+                <w:lang w:val="en-US"/>
+              </w:rPr>
               <w:t>Kejuruan</w:t>
             </w:r>
+            <w:proofErr w:type="spellEnd"/>
           </w:p>
         </w:tc>
         <w:tc>
@@ -194,7 +213,22 @@
             <w:vAlign w:val="center"/>
           </w:tcPr>
           <w:p>
+            <w:pPr>
+              <w:spacing w:before="60" w:after="60"/>
+              <w:rPr>
+                <w:rFonts w:ascii="Tahoma" w:eastAsia="Tahoma" w:hAnsi="Tahoma" w:cs="Tahoma"/>
+                <w:b/>
+                <w:sz w:val="22"/>
+                <w:szCs w:val="22"/>
+              </w:rPr>
+            </w:pPr>
             <w:r>
+              <w:rPr>
+                <w:rFonts w:ascii="Tahoma" w:eastAsia="Tahoma" w:hAnsi="Tahoma" w:cs="Tahoma"/>
+                <w:b/>
+                <w:sz w:val="22"/>
+                <w:szCs w:val="22"/>
+              </w:rPr>
               <w:t>:</w:t>
             </w:r>
           </w:p>
@@ -210,7 +244,7 @@
           </w:tcPr>
           <w:p>
             <w:r>
-              <w:t>Teknologi Informasi dan Komunikasi (TIK)</w:t>
+              <w:t>TIK</w:t>
             </w:r>
           </w:p>
         </w:tc>
@@ -303,7 +337,22 @@
             <w:vAlign w:val="center"/>
           </w:tcPr>
           <w:p>
+            <w:pPr>
+              <w:spacing w:before="60" w:after="60"/>
+              <w:rPr>
+                <w:rFonts w:ascii="Tahoma" w:eastAsia="Tahoma" w:hAnsi="Tahoma" w:cs="Tahoma"/>
+                <w:b/>
+                <w:sz w:val="22"/>
+                <w:szCs w:val="22"/>
+              </w:rPr>
+            </w:pPr>
             <w:r>
+              <w:rPr>
+                <w:rFonts w:ascii="Tahoma" w:eastAsia="Tahoma" w:hAnsi="Tahoma" w:cs="Tahoma"/>
+                <w:b/>
+                <w:sz w:val="22"/>
+                <w:szCs w:val="22"/>
+              </w:rPr>
               <w:t>Penyajian ke</w:t>
             </w:r>
           </w:p>
@@ -318,7 +367,22 @@
             <w:vAlign w:val="center"/>
           </w:tcPr>
           <w:p>
+            <w:pPr>
+              <w:spacing w:before="60" w:after="60"/>
+              <w:rPr>
+                <w:rFonts w:ascii="Tahoma" w:eastAsia="Tahoma" w:hAnsi="Tahoma" w:cs="Tahoma"/>
+                <w:b/>
+                <w:sz w:val="22"/>
+                <w:szCs w:val="22"/>
+              </w:rPr>
+            </w:pPr>
             <w:r>
+              <w:rPr>
+                <w:rFonts w:ascii="Tahoma" w:eastAsia="Tahoma" w:hAnsi="Tahoma" w:cs="Tahoma"/>
+                <w:b/>
+                <w:sz w:val="22"/>
+                <w:szCs w:val="22"/>
+              </w:rPr>
               <w:t>:</w:t>
             </w:r>
           </w:p>
@@ -412,9 +476,14 @@
             <w:vAlign w:val="center"/>
           </w:tcPr>
           <w:p>
-            <w:r>
-              <w:t>Menciptakan Karya Desain</w:t>
-            </w:r>
+            <w:pPr>
+              <w:spacing w:before="60" w:after="60"/>
+              <w:rPr>
+                <w:rFonts w:ascii="Tahoma" w:eastAsia="Tahoma" w:hAnsi="Tahoma" w:cs="Tahoma"/>
+                <w:sz w:val="22"/>
+                <w:szCs w:val="22"/>
+              </w:rPr>
+            </w:pPr>
           </w:p>
         </w:tc>
         <w:tc>
@@ -427,8 +496,23 @@
             <w:vAlign w:val="center"/>
           </w:tcPr>
           <w:p>
+            <w:pPr>
+              <w:spacing w:before="60" w:after="60"/>
+              <w:rPr>
+                <w:rFonts w:ascii="Tahoma" w:eastAsia="Tahoma" w:hAnsi="Tahoma" w:cs="Tahoma"/>
+                <w:b/>
+                <w:sz w:val="22"/>
+                <w:szCs w:val="22"/>
+              </w:rPr>
+            </w:pPr>
             <w:r>
-              <w:t>Waktu</w:t>
+              <w:rPr>
+                <w:rFonts w:ascii="Tahoma" w:eastAsia="Tahoma" w:hAnsi="Tahoma" w:cs="Tahoma"/>
+                <w:b/>
+                <w:sz w:val="22"/>
+                <w:szCs w:val="22"/>
+              </w:rPr>
+              <w:t xml:space="preserve">Waktu </w:t>
             </w:r>
           </w:p>
         </w:tc>
@@ -442,7 +526,22 @@
             <w:vAlign w:val="center"/>
           </w:tcPr>
           <w:p>
+            <w:pPr>
+              <w:spacing w:before="60" w:after="60"/>
+              <w:rPr>
+                <w:rFonts w:ascii="Tahoma" w:eastAsia="Tahoma" w:hAnsi="Tahoma" w:cs="Tahoma"/>
+                <w:b/>
+                <w:sz w:val="22"/>
+                <w:szCs w:val="22"/>
+              </w:rPr>
+            </w:pPr>
             <w:r>
+              <w:rPr>
+                <w:rFonts w:ascii="Tahoma" w:eastAsia="Tahoma" w:hAnsi="Tahoma" w:cs="Tahoma"/>
+                <w:b/>
+                <w:sz w:val="22"/>
+                <w:szCs w:val="22"/>
+              </w:rPr>
               <w:t>:</w:t>
             </w:r>
           </w:p>
@@ -471,7 +570,7 @@
           </w:tcPr>
           <w:p>
             <w:r>
-              <w:t>Finishing Desain: Pre-flighting, Color Mode, &amp; Exporting Final Artwork (Cetak &amp; Digital)</w:t>
+              <w:t>Finishing: Pre-flighting &amp; Exporting</w:t>
             </w:r>
           </w:p>
         </w:tc>
@@ -484,7 +583,7 @@
           </w:tcPr>
           <w:p>
             <w:r>
-              <w:t>Setelah selesai mengikuti pelatihan ini peserta kompeten dalam melakukan proses pre-flighting (pengecekan resolusi, bleed, color mode CMYK/RGB) dan exporting final artwork sesuai standar spesifikasi industri cetak maupun digital secara mandiri dan presisi</w:t>
+              <w:t>Menyiapkan file akhir untuk kebutuhan cetak dan digital.</w:t>
             </w:r>
           </w:p>
         </w:tc>
@@ -504,7 +603,23 @@
             </w:tcBorders>
           </w:tcPr>
           <w:p>
+            <w:pPr>
+              <w:spacing w:before="120"/>
+              <w:jc w:val="both"/>
+              <w:rPr>
+                <w:rFonts w:ascii="Tahoma" w:eastAsia="Tahoma" w:hAnsi="Tahoma" w:cs="Tahoma"/>
+                <w:b/>
+                <w:sz w:val="22"/>
+                <w:szCs w:val="22"/>
+              </w:rPr>
+            </w:pPr>
             <w:r>
+              <w:rPr>
+                <w:rFonts w:ascii="Tahoma" w:eastAsia="Tahoma" w:hAnsi="Tahoma" w:cs="Tahoma"/>
+                <w:b/>
+                <w:sz w:val="22"/>
+                <w:szCs w:val="22"/>
+              </w:rPr>
               <w:t>Metode Mengajar</w:t>
             </w:r>
           </w:p>
@@ -515,13 +630,28 @@
             <w:gridSpan w:val="6"/>
           </w:tcPr>
           <w:p>
-            <w:r>
-              <w:t>Ceramah</w:t>
-              <w:br/>
-              <w:t>Praktikum</w:t>
-              <w:br/>
-              <w:t>Diskusi</w:t>
-            </w:r>
+            <w:pPr>
+              <w:numPr>
+                <w:ilvl w:val="0"/>
+                <w:numId w:val="2"/>
+              </w:numPr>
+              <w:pBdr>
+                <w:top w:val="nil"/>
+                <w:left w:val="nil"/>
+                <w:bottom w:val="nil"/>
+                <w:right w:val="nil"/>
+                <w:between w:val="nil"/>
+              </w:pBdr>
+              <w:spacing w:after="120"/>
+              <w:ind w:left="294" w:hanging="284"/>
+              <w:jc w:val="both"/>
+              <w:rPr>
+                <w:rFonts w:ascii="Tahoma" w:eastAsia="Tahoma" w:hAnsi="Tahoma" w:cs="Tahoma"/>
+                <w:color w:val="000000" w:themeColor="text1"/>
+                <w:sz w:val="22"/>
+                <w:szCs w:val="22"/>
+              </w:rPr>
+            </w:pPr>
           </w:p>
         </w:tc>
       </w:tr>
@@ -538,12 +668,54 @@
             <w:vMerge w:val="restart"/>
           </w:tcPr>
           <w:p>
+            <w:pPr>
+              <w:spacing w:before="120"/>
+              <w:jc w:val="both"/>
+              <w:rPr>
+                <w:rFonts w:ascii="Tahoma" w:eastAsia="Tahoma" w:hAnsi="Tahoma" w:cs="Tahoma"/>
+                <w:b/>
+                <w:sz w:val="22"/>
+                <w:szCs w:val="22"/>
+              </w:rPr>
+            </w:pPr>
             <w:r>
+              <w:rPr>
+                <w:rFonts w:ascii="Tahoma" w:eastAsia="Tahoma" w:hAnsi="Tahoma" w:cs="Tahoma"/>
+                <w:b/>
+                <w:sz w:val="22"/>
+                <w:szCs w:val="22"/>
+              </w:rPr>
               <w:t>Media Pembelajaran</w:t>
-              <w:br/>
+            </w:r>
+          </w:p>
+          <w:p>
+            <w:pPr>
+              <w:jc w:val="both"/>
+              <w:rPr>
+                <w:rFonts w:ascii="Tahoma" w:eastAsia="Tahoma" w:hAnsi="Tahoma" w:cs="Tahoma"/>
+                <w:sz w:val="22"/>
+                <w:szCs w:val="22"/>
+              </w:rPr>
+            </w:pPr>
+            <w:r>
+              <w:rPr>
+                <w:rFonts w:ascii="Tahoma" w:eastAsia="Tahoma" w:hAnsi="Tahoma" w:cs="Tahoma"/>
+                <w:sz w:val="22"/>
+                <w:szCs w:val="22"/>
+              </w:rPr>
               <w:t>(Media, Alat, Bahan)</w:t>
             </w:r>
           </w:p>
+          <w:p>
+            <w:pPr>
+              <w:jc w:val="both"/>
+              <w:rPr>
+                <w:rFonts w:ascii="Tahoma" w:eastAsia="Tahoma" w:hAnsi="Tahoma" w:cs="Tahoma"/>
+                <w:sz w:val="22"/>
+                <w:szCs w:val="22"/>
+              </w:rPr>
+            </w:pPr>
+          </w:p>
         </w:tc>
         <w:tc>
           <w:tcPr>
@@ -551,13 +723,57 @@
             <w:gridSpan w:val="6"/>
           </w:tcPr>
           <w:p>
+            <w:pPr>
+              <w:pBdr>
+                <w:top w:val="nil"/>
+                <w:left w:val="nil"/>
+                <w:bottom w:val="nil"/>
+                <w:right w:val="nil"/>
+                <w:between w:val="nil"/>
+              </w:pBdr>
+              <w:spacing w:before="120" w:line="276" w:lineRule="auto"/>
+              <w:ind w:left="52"/>
+              <w:jc w:val="both"/>
+              <w:rPr>
+                <w:rFonts w:ascii="Tahoma" w:eastAsia="Tahoma" w:hAnsi="Tahoma" w:cs="Tahoma"/>
+                <w:color w:val="000000" w:themeColor="text1"/>
+                <w:sz w:val="22"/>
+                <w:szCs w:val="22"/>
+              </w:rPr>
+            </w:pPr>
             <w:r>
+              <w:rPr>
+                <w:rFonts w:ascii="Tahoma" w:eastAsia="Tahoma" w:hAnsi="Tahoma" w:cs="Tahoma"/>
+                <w:color w:val="000000" w:themeColor="text1"/>
+                <w:sz w:val="22"/>
+                <w:szCs w:val="22"/>
+              </w:rPr>
               <w:t>Media</w:t>
-              <w:br/>
-              <w:t>Power Point</w:t>
-              <w:br/>
-              <w:t>Gambar dan Video Contoh Cetak vs Digital</w:t>
             </w:r>
+          </w:p>
+          <w:p>
+            <w:pPr>
+              <w:numPr>
+                <w:ilvl w:val="0"/>
+                <w:numId w:val="3"/>
+              </w:numPr>
+              <w:pBdr>
+                <w:top w:val="nil"/>
+                <w:left w:val="nil"/>
+                <w:bottom w:val="nil"/>
+                <w:right w:val="nil"/>
+                <w:between w:val="nil"/>
+              </w:pBdr>
+              <w:spacing w:after="120" w:line="276" w:lineRule="auto"/>
+              <w:ind w:left="294" w:hanging="242"/>
+              <w:jc w:val="both"/>
+              <w:rPr>
+                <w:rFonts w:ascii="Tahoma" w:eastAsia="Tahoma" w:hAnsi="Tahoma" w:cs="Tahoma"/>
+                <w:color w:val="000000" w:themeColor="text1"/>
+                <w:sz w:val="22"/>
+                <w:szCs w:val="22"/>
+              </w:rPr>
+            </w:pPr>
           </w:p>
         </w:tc>
       </w:tr>
@@ -592,15 +808,57 @@
             <w:gridSpan w:val="6"/>
           </w:tcPr>
           <w:p>
+            <w:pPr>
+              <w:pBdr>
+                <w:top w:val="nil"/>
+                <w:left w:val="nil"/>
+                <w:bottom w:val="nil"/>
+                <w:right w:val="nil"/>
+                <w:between w:val="nil"/>
+              </w:pBdr>
+              <w:spacing w:before="120" w:line="276" w:lineRule="auto"/>
+              <w:ind w:left="52"/>
+              <w:jc w:val="both"/>
+              <w:rPr>
+                <w:rFonts w:ascii="Tahoma" w:eastAsia="Tahoma" w:hAnsi="Tahoma" w:cs="Tahoma"/>
+                <w:color w:val="000000" w:themeColor="text1"/>
+                <w:sz w:val="22"/>
+                <w:szCs w:val="22"/>
+              </w:rPr>
+            </w:pPr>
             <w:r>
+              <w:rPr>
+                <w:rFonts w:ascii="Tahoma" w:eastAsia="Tahoma" w:hAnsi="Tahoma" w:cs="Tahoma"/>
+                <w:color w:val="000000" w:themeColor="text1"/>
+                <w:sz w:val="22"/>
+                <w:szCs w:val="22"/>
+              </w:rPr>
               <w:t>Alat</w:t>
-              <w:br/>
-              <w:t>Proyektor dan Layar</w:t>
-              <w:br/>
-              <w:t>Perangkat Komputer / Workstation Lab</w:t>
-              <w:br/>
-              <w:t>Papan Tulis, Spidol dan Penghapus</w:t>
             </w:r>
+          </w:p>
+          <w:p>
+            <w:pPr>
+              <w:numPr>
+                <w:ilvl w:val="0"/>
+                <w:numId w:val="7"/>
+              </w:numPr>
+              <w:pBdr>
+                <w:top w:val="nil"/>
+                <w:left w:val="nil"/>
+                <w:bottom w:val="nil"/>
+                <w:right w:val="nil"/>
+                <w:between w:val="nil"/>
+              </w:pBdr>
+              <w:spacing w:after="120" w:line="276" w:lineRule="auto"/>
+              <w:ind w:left="294" w:hanging="242"/>
+              <w:jc w:val="both"/>
+              <w:rPr>
+                <w:rFonts w:ascii="Tahoma" w:eastAsia="Tahoma" w:hAnsi="Tahoma" w:cs="Tahoma"/>
+                <w:color w:val="000000" w:themeColor="text1"/>
+                <w:sz w:val="22"/>
+                <w:szCs w:val="22"/>
+              </w:rPr>
+            </w:pPr>
           </w:p>
         </w:tc>
       </w:tr>
@@ -638,15 +896,57 @@
             <w:gridSpan w:val="6"/>
           </w:tcPr>
           <w:p>
+            <w:pPr>
+              <w:pBdr>
+                <w:top w:val="nil"/>
+                <w:left w:val="nil"/>
+                <w:bottom w:val="nil"/>
+                <w:right w:val="nil"/>
+                <w:between w:val="nil"/>
+              </w:pBdr>
+              <w:spacing w:before="120" w:line="276" w:lineRule="auto"/>
+              <w:ind w:left="52"/>
+              <w:jc w:val="both"/>
+              <w:rPr>
+                <w:rFonts w:ascii="Tahoma" w:eastAsia="Tahoma" w:hAnsi="Tahoma" w:cs="Tahoma"/>
+                <w:color w:val="000000" w:themeColor="text1"/>
+                <w:sz w:val="22"/>
+                <w:szCs w:val="22"/>
+              </w:rPr>
+            </w:pPr>
             <w:r>
+              <w:rPr>
+                <w:rFonts w:ascii="Tahoma" w:eastAsia="Tahoma" w:hAnsi="Tahoma" w:cs="Tahoma"/>
+                <w:color w:val="000000" w:themeColor="text1"/>
+                <w:sz w:val="22"/>
+                <w:szCs w:val="22"/>
+              </w:rPr>
               <w:t>Bahan</w:t>
-              <w:br/>
-              <w:t>Flashdisk</w:t>
-              <w:br/>
-              <w:t>Master File Design</w:t>
-              <w:br/>
-              <w:t>Software Grafis (Adobe Illustrator/Photoshop/Canva)</w:t>
             </w:r>
+          </w:p>
+          <w:p>
+            <w:pPr>
+              <w:numPr>
+                <w:ilvl w:val="0"/>
+                <w:numId w:val="8"/>
+              </w:numPr>
+              <w:pBdr>
+                <w:top w:val="nil"/>
+                <w:left w:val="nil"/>
+                <w:bottom w:val="nil"/>
+                <w:right w:val="nil"/>
+                <w:between w:val="nil"/>
+              </w:pBdr>
+              <w:spacing w:after="120" w:line="276" w:lineRule="auto"/>
+              <w:ind w:left="294" w:hanging="242"/>
+              <w:jc w:val="both"/>
+              <w:rPr>
+                <w:rFonts w:ascii="Tahoma" w:eastAsia="Tahoma" w:hAnsi="Tahoma" w:cs="Tahoma"/>
+                <w:color w:val="000000" w:themeColor="text1"/>
+                <w:sz w:val="22"/>
+                <w:szCs w:val="22"/>
+              </w:rPr>
+            </w:pPr>
           </w:p>
         </w:tc>
       </w:tr>
@@ -688,9 +988,21 @@
             <w:gridSpan w:val="6"/>
           </w:tcPr>
           <w:p>
-            <w:r>
-              <w:t>Persiapan</w:t>
-            </w:r>
+            <w:pPr>
+              <w:numPr>
+                <w:ilvl w:val="0"/>
+                <w:numId w:val="5"/>
+              </w:numPr>
+              <w:spacing w:after="120" w:line="276" w:lineRule="auto"/>
+              <w:ind w:left="294" w:hanging="284"/>
+              <w:jc w:val="both"/>
+              <w:rPr>
+                <w:rFonts w:ascii="Tahoma" w:eastAsia="Tahoma" w:hAnsi="Tahoma" w:cs="Tahoma"/>
+                <w:color w:val="000000" w:themeColor="text1"/>
+                <w:sz w:val="22"/>
+                <w:szCs w:val="22"/>
+              </w:rPr>
+            </w:pPr>
           </w:p>
         </w:tc>
       </w:tr>
@@ -737,20 +1049,20 @@
             <w:vMerge w:val="restart"/>
           </w:tcPr>
           <w:p>
+            <w:pPr>
+              <w:rPr>
+                <w:rFonts w:ascii="Tahoma" w:eastAsia="Tahoma" w:hAnsi="Tahoma" w:cs="Tahoma"/>
+                <w:sz w:val="22"/>
+                <w:szCs w:val="22"/>
+              </w:rPr>
+            </w:pPr>
             <w:r>
-              <w:t>1. Memberi salam dan Memperkenalkan diri</w:t>
-              <w:br/>
-              <w:t>2. Mengabsen peserta pelatihan</w:t>
-              <w:br/>
-              <w:t>3. Menjelaskan safety induction dan rules</w:t>
-              <w:br/>
-              <w:t>4. Mengadakan apersepsi (dampak salah mode warna saat cetak)</w:t>
-              <w:br/>
-              <w:t>5. Menyampaikan judul</w:t>
-              <w:br/>
-              <w:t>6. Roadmap pelatihan</w:t>
-              <w:br/>
-              <w:t>7. Menyampaikan tujuan dan manfaat belajar</w:t>
+              <w:rPr>
+                <w:rFonts w:ascii="Tahoma" w:eastAsia="Tahoma" w:hAnsi="Tahoma" w:cs="Tahoma"/>
+                <w:sz w:val="22"/>
+                <w:szCs w:val="22"/>
+              </w:rPr>
+              <w:t>1</w:t>
             </w:r>
           </w:p>
         </w:tc>
@@ -759,7 +1071,24 @@
             <w:tcW w:w="1850" w:type="dxa"/>
           </w:tcPr>
           <w:p>
+            <w:pPr>
+              <w:spacing w:before="120" w:after="120"/>
+              <w:ind w:left="26"/>
+              <w:jc w:val="center"/>
+              <w:rPr>
+                <w:rFonts w:ascii="Tahoma" w:eastAsia="Tahoma" w:hAnsi="Tahoma" w:cs="Tahoma"/>
+                <w:b/>
+                <w:sz w:val="22"/>
+                <w:szCs w:val="22"/>
+              </w:rPr>
+            </w:pPr>
             <w:r>
+              <w:rPr>
+                <w:rFonts w:ascii="Tahoma" w:eastAsia="Tahoma" w:hAnsi="Tahoma" w:cs="Tahoma"/>
+                <w:b/>
+                <w:sz w:val="22"/>
+                <w:szCs w:val="22"/>
+              </w:rPr>
               <w:t>Perkiraan Waktu</w:t>
             </w:r>
           </w:p>
@@ -826,9 +1155,15 @@
             <w:tcW w:w="1850" w:type="dxa"/>
           </w:tcPr>
           <w:p>
-            <w:r>
-              <w:t>10 menit</w:t>
-            </w:r>
+            <w:pPr>
+              <w:ind w:left="26"/>
+              <w:jc w:val="center"/>
+              <w:rPr>
+                <w:rFonts w:ascii="Tahoma" w:eastAsia="Tahoma" w:hAnsi="Tahoma" w:cs="Tahoma"/>
+                <w:sz w:val="22"/>
+                <w:szCs w:val="22"/>
+              </w:rPr>
+            </w:pPr>
           </w:p>
         </w:tc>
       </w:tr>
@@ -847,7 +1182,25 @@
             <w:vAlign w:val="center"/>
           </w:tcPr>
           <w:p>
+            <w:pPr>
+              <w:pStyle w:val="ListParagraph"/>
+              <w:numPr>
+                <w:ilvl w:val="0"/>
+                <w:numId w:val="6"/>
+              </w:numPr>
+              <w:spacing w:before="120" w:after="120"/>
+              <w:ind w:left="294" w:hanging="284"/>
+              <w:jc w:val="both"/>
+              <w:rPr>
+                <w:rFonts w:ascii="Tahoma" w:eastAsia="Tahoma" w:hAnsi="Tahoma" w:cs="Tahoma"/>
+                <w:i/>
+              </w:rPr>
+            </w:pPr>
             <w:r>
+              <w:rPr>
+                <w:rFonts w:ascii="Tahoma" w:eastAsia="Tahoma" w:hAnsi="Tahoma" w:cs="Tahoma"/>
+                <w:b/>
+              </w:rPr>
               <w:t>Penyajian</w:t>
             </w:r>
           </w:p>
@@ -933,9 +1286,46 @@
             <w:vAlign w:val="center"/>
           </w:tcPr>
           <w:p>
+            <w:pPr>
+              <w:jc w:val="center"/>
+              <w:rPr>
+                <w:rFonts w:ascii="Tahoma" w:eastAsia="Tahoma" w:hAnsi="Tahoma" w:cs="Tahoma"/>
+                <w:b/>
+                <w:sz w:val="22"/>
+                <w:szCs w:val="22"/>
+              </w:rPr>
+            </w:pPr>
+          </w:p>
+          <w:p>
+            <w:pPr>
+              <w:jc w:val="center"/>
+              <w:rPr>
+                <w:rFonts w:ascii="Tahoma" w:eastAsia="Tahoma" w:hAnsi="Tahoma" w:cs="Tahoma"/>
+                <w:b/>
+                <w:sz w:val="22"/>
+                <w:szCs w:val="22"/>
+              </w:rPr>
+            </w:pPr>
             <w:r>
+              <w:rPr>
+                <w:rFonts w:ascii="Tahoma" w:eastAsia="Tahoma" w:hAnsi="Tahoma" w:cs="Tahoma"/>
+                <w:b/>
+                <w:sz w:val="22"/>
+                <w:szCs w:val="22"/>
+              </w:rPr>
               <w:t>Sub Judul</w:t>
             </w:r>
+          </w:p>
+          <w:p>
+            <w:pPr>
+              <w:jc w:val="center"/>
+              <w:rPr>
+                <w:rFonts w:ascii="Tahoma" w:eastAsia="Tahoma" w:hAnsi="Tahoma" w:cs="Tahoma"/>
+                <w:i/>
+                <w:sz w:val="22"/>
+                <w:szCs w:val="22"/>
+              </w:rPr>
+            </w:pPr>
           </w:p>
         </w:tc>
         <w:tc>
@@ -945,9 +1335,46 @@
             <w:vAlign w:val="center"/>
           </w:tcPr>
           <w:p>
+            <w:pPr>
+              <w:jc w:val="center"/>
+              <w:rPr>
+                <w:rFonts w:ascii="Tahoma" w:eastAsia="Tahoma" w:hAnsi="Tahoma" w:cs="Tahoma"/>
+                <w:b/>
+                <w:sz w:val="22"/>
+                <w:szCs w:val="22"/>
+              </w:rPr>
+            </w:pPr>
+          </w:p>
+          <w:p>
+            <w:pPr>
+              <w:jc w:val="center"/>
+              <w:rPr>
+                <w:rFonts w:ascii="Tahoma" w:eastAsia="Tahoma" w:hAnsi="Tahoma" w:cs="Tahoma"/>
+                <w:b/>
+                <w:sz w:val="22"/>
+                <w:szCs w:val="22"/>
+              </w:rPr>
+            </w:pPr>
             <w:r>
+              <w:rPr>
+                <w:rFonts w:ascii="Tahoma" w:eastAsia="Tahoma" w:hAnsi="Tahoma" w:cs="Tahoma"/>
+                <w:b/>
+                <w:sz w:val="22"/>
+                <w:szCs w:val="22"/>
+              </w:rPr>
               <w:t>Uraian Kegiatan</w:t>
             </w:r>
+          </w:p>
+          <w:p>
+            <w:pPr>
+              <w:jc w:val="center"/>
+              <w:rPr>
+                <w:rFonts w:ascii="Tahoma" w:eastAsia="Tahoma" w:hAnsi="Tahoma" w:cs="Tahoma"/>
+                <w:i/>
+                <w:sz w:val="22"/>
+                <w:szCs w:val="22"/>
+              </w:rPr>
+            </w:pPr>
           </w:p>
         </w:tc>
         <w:tc>
@@ -957,7 +1384,21 @@
             <w:vAlign w:val="center"/>
           </w:tcPr>
           <w:p>
+            <w:pPr>
+              <w:jc w:val="center"/>
+              <w:rPr>
+                <w:rFonts w:ascii="Tahoma" w:eastAsia="Tahoma" w:hAnsi="Tahoma" w:cs="Tahoma"/>
+                <w:sz w:val="22"/>
+                <w:szCs w:val="22"/>
+              </w:rPr>
+            </w:pPr>
             <w:r>
+              <w:rPr>
+                <w:rFonts w:ascii="Tahoma" w:eastAsia="Tahoma" w:hAnsi="Tahoma" w:cs="Tahoma"/>
+                <w:b/>
+                <w:sz w:val="22"/>
+                <w:szCs w:val="22"/>
+              </w:rPr>
               <w:t>Media Pembelajaran</w:t>
             </w:r>
           </w:p>
@@ -968,8 +1409,32 @@
             <w:vAlign w:val="center"/>
           </w:tcPr>
           <w:p>
+            <w:pPr>
+              <w:jc w:val="center"/>
+              <w:rPr>
+                <w:rFonts w:ascii="Tahoma" w:eastAsia="Tahoma" w:hAnsi="Tahoma" w:cs="Tahoma"/>
+                <w:i/>
+                <w:sz w:val="22"/>
+                <w:szCs w:val="22"/>
+              </w:rPr>
+            </w:pPr>
             <w:r>
+              <w:rPr>
+                <w:rFonts w:ascii="Tahoma" w:eastAsia="Tahoma" w:hAnsi="Tahoma" w:cs="Tahoma"/>
+                <w:b/>
+                <w:sz w:val="22"/>
+                <w:szCs w:val="22"/>
+              </w:rPr>
               <w:t>Perkiraan Waktu</w:t>
+            </w:r>
+            <w:r>
+              <w:rPr>
+                <w:rFonts w:ascii="Tahoma" w:eastAsia="Tahoma" w:hAnsi="Tahoma" w:cs="Tahoma"/>
+                <w:i/>
+                <w:sz w:val="22"/>
+                <w:szCs w:val="22"/>
+              </w:rPr>
+              <w:t xml:space="preserve"> </w:t>
             </w:r>
           </w:p>
         </w:tc>
@@ -986,9 +1451,72 @@
             <w:gridSpan w:val="3"/>
           </w:tcPr>
           <w:p>
+            <w:pPr>
+              <w:pStyle w:val="ListParagraph"/>
+              <w:numPr>
+                <w:ilvl w:val="3"/>
+                <w:numId w:val="5"/>
+              </w:numPr>
+              <w:spacing w:before="60"/>
+              <w:ind w:left="292"/>
+              <w:rPr>
+                <w:rFonts w:ascii="Tahoma" w:eastAsia="Tahoma" w:hAnsi="Tahoma" w:cs="Tahoma"/>
+                <w:b/>
+              </w:rPr>
+            </w:pPr>
             <w:r>
-              <w:t>Konsep Pre-flighting &amp; Exporting</w:t>
+              <w:rPr>
+                <w:rFonts w:ascii="Tahoma" w:eastAsia="Tahoma" w:hAnsi="Tahoma" w:cs="Tahoma"/>
+                <w:b/>
+              </w:rPr>
+              <w:t>Dasar-dasar Copywriting</w:t>
             </w:r>
+          </w:p>
+          <w:p>
+            <w:pPr>
+              <w:spacing w:before="60"/>
+              <w:rPr>
+                <w:rFonts w:ascii="Tahoma" w:eastAsia="Tahoma" w:hAnsi="Tahoma" w:cs="Tahoma"/>
+                <w:b/>
+              </w:rPr>
+            </w:pPr>
+          </w:p>
+          <w:p>
+            <w:pPr>
+              <w:spacing w:before="60"/>
+              <w:rPr>
+                <w:rFonts w:ascii="Tahoma" w:eastAsia="Tahoma" w:hAnsi="Tahoma" w:cs="Tahoma"/>
+                <w:b/>
+              </w:rPr>
+            </w:pPr>
+          </w:p>
+          <w:p>
+            <w:pPr>
+              <w:spacing w:before="60"/>
+              <w:rPr>
+                <w:rFonts w:ascii="Tahoma" w:eastAsia="Tahoma" w:hAnsi="Tahoma" w:cs="Tahoma"/>
+                <w:b/>
+              </w:rPr>
+            </w:pPr>
+          </w:p>
+          <w:p>
+            <w:pPr>
+              <w:spacing w:before="60"/>
+              <w:rPr>
+                <w:rFonts w:ascii="Tahoma" w:eastAsia="Tahoma" w:hAnsi="Tahoma" w:cs="Tahoma"/>
+                <w:b/>
+              </w:rPr>
+            </w:pPr>
+          </w:p>
+          <w:p>
+            <w:pPr>
+              <w:pStyle w:val="ListParagraph"/>
+              <w:spacing w:before="60"/>
+              <w:rPr>
+                <w:rFonts w:ascii="Tahoma" w:eastAsia="Tahoma" w:hAnsi="Tahoma" w:cs="Tahoma"/>
+                <w:b/>
+              </w:rPr>
+            </w:pPr>
           </w:p>
         </w:tc>
         <w:tc>
@@ -997,17 +1525,26 @@
             <w:gridSpan w:val="2"/>
           </w:tcPr>
           <w:p>
-            <w:r>
-              <w:t>Instruktur menjelaskan kepada peserta terkait:</w:t>
-              <w:br/>
-              <w:t>- Pengertian pre-flighting (Bleed, Margin, Resolution 300 DPI)</w:t>
-              <w:br/>
-              <w:t>- Perbedaan mode warna CMYK (cetak) vs RGB (digital)</w:t>
-              <w:br/>
-              <w:t>- Perbedaan format output (.PDF/X-1a, .TIFF, .PNG, .SVG)</w:t>
-              <w:br/>
-              <w:t>Instruktur menanyakan kepada peserta apakah materi yang disampaikan telah dipahami dan memberikan kesempatan kepada peserta untuk mengajukan pertanyaan</w:t>
-            </w:r>
+            <w:pPr>
+              <w:pStyle w:val="ListParagraph"/>
+              <w:numPr>
+                <w:ilvl w:val="0"/>
+                <w:numId w:val="4"/>
+              </w:numPr>
+              <w:pBdr>
+                <w:top w:val="nil"/>
+                <w:left w:val="nil"/>
+                <w:bottom w:val="nil"/>
+                <w:right w:val="nil"/>
+                <w:between w:val="nil"/>
+              </w:pBdr>
+              <w:spacing w:before="60"/>
+              <w:ind w:left="171" w:right="89" w:hanging="283"/>
+              <w:rPr>
+                <w:rFonts w:ascii="Tahoma" w:eastAsia="Tahoma" w:hAnsi="Tahoma" w:cs="Tahoma"/>
+                <w:color w:val="000000"/>
+              </w:rPr>
+            </w:pPr>
           </w:p>
         </w:tc>
         <w:tc>
@@ -1016,11 +1553,23 @@
             <w:gridSpan w:val="3"/>
           </w:tcPr>
           <w:p>
-            <w:r>
-              <w:t>Power Point</w:t>
-              <w:br/>
-              <w:t>Gambar &amp; Sample Cetak</w:t>
-            </w:r>
+            <w:pPr>
+              <w:pBdr>
+                <w:top w:val="nil"/>
+                <w:left w:val="nil"/>
+                <w:bottom w:val="nil"/>
+                <w:right w:val="nil"/>
+                <w:between w:val="nil"/>
+              </w:pBdr>
+              <w:spacing w:before="60" w:line="276" w:lineRule="auto"/>
+              <w:ind w:left="253" w:right="89"/>
+              <w:rPr>
+                <w:rFonts w:ascii="Tahoma" w:eastAsia="Tahoma" w:hAnsi="Tahoma" w:cs="Tahoma"/>
+                <w:color w:val="000000"/>
+                <w:sz w:val="22"/>
+                <w:szCs w:val="22"/>
+              </w:rPr>
+            </w:pPr>
           </w:p>
         </w:tc>
         <w:tc>
@@ -1028,9 +1577,15 @@
             <w:tcW w:w="1850" w:type="dxa"/>
           </w:tcPr>
           <w:p>
-            <w:r>
-              <w:t>35 menit</w:t>
-            </w:r>
+            <w:pPr>
+              <w:spacing w:before="60"/>
+              <w:jc w:val="center"/>
+              <w:rPr>
+                <w:rFonts w:ascii="Tahoma" w:eastAsia="Tahoma" w:hAnsi="Tahoma" w:cs="Tahoma"/>
+                <w:sz w:val="22"/>
+                <w:szCs w:val="22"/>
+              </w:rPr>
+            </w:pPr>
           </w:p>
         </w:tc>
       </w:tr>
@@ -1046,8 +1601,25 @@
             <w:gridSpan w:val="3"/>
           </w:tcPr>
           <w:p>
+            <w:pPr>
+              <w:pStyle w:val="ListParagraph"/>
+              <w:numPr>
+                <w:ilvl w:val="3"/>
+                <w:numId w:val="5"/>
+              </w:numPr>
+              <w:spacing w:before="60"/>
+              <w:ind w:left="292"/>
+              <w:rPr>
+                <w:rFonts w:ascii="Tahoma" w:eastAsia="Tahoma" w:hAnsi="Tahoma" w:cs="Tahoma"/>
+                <w:b/>
+              </w:rPr>
+            </w:pPr>
             <w:r>
-              <w:t>Demonstrasi Setting Bleed &amp; Export PDF</w:t>
+              <w:rPr>
+                <w:rFonts w:ascii="Tahoma" w:eastAsia="Tahoma" w:hAnsi="Tahoma" w:cs="Tahoma"/>
+                <w:b/>
+              </w:rPr>
+              <w:t>Pengenalan Tools AI ( ChatGPT dan Canva AI)</w:t>
             </w:r>
           </w:p>
         </w:tc>
@@ -1057,17 +1629,27 @@
             <w:gridSpan w:val="2"/>
           </w:tcPr>
           <w:p>
-            <w:r>
-              <w:t>Instruktur menjelaskan &amp; mendemonstrasikan kepada peserta terkait:</w:t>
-              <w:br/>
-              <w:t>- Praktik setting Bleed &amp; Color Space di Adobe Illustrator/Canva</w:t>
-              <w:br/>
-              <w:t>- Demonstrasi Export PDF Siap Cetak (PDF/X) &amp; Web-Optimized</w:t>
-              <w:br/>
-              <w:t>- Cara memeriksa resolusi 300 DPI dan outline font</w:t>
-              <w:br/>
-              <w:t>Instruktur menanyakan kepada peserta apakah materi yang disampaikan telah dipahami dan memberikan kesempatan kepada peserta untuk mengajukan pertanyaan</w:t>
-            </w:r>
+            <w:pPr>
+              <w:numPr>
+                <w:ilvl w:val="0"/>
+                <w:numId w:val="4"/>
+              </w:numPr>
+              <w:pBdr>
+                <w:top w:val="nil"/>
+                <w:left w:val="nil"/>
+                <w:bottom w:val="nil"/>
+                <w:right w:val="nil"/>
+                <w:between w:val="nil"/>
+              </w:pBdr>
+              <w:spacing w:before="60" w:line="276" w:lineRule="auto"/>
+              <w:ind w:left="171" w:right="89" w:hanging="283"/>
+              <w:rPr>
+                <w:rFonts w:ascii="Tahoma" w:eastAsia="Tahoma" w:hAnsi="Tahoma" w:cs="Tahoma"/>
+                <w:color w:val="000000"/>
+                <w:sz w:val="22"/>
+                <w:szCs w:val="22"/>
+              </w:rPr>
+            </w:pPr>
           </w:p>
         </w:tc>
         <w:tc>
@@ -1076,11 +1658,23 @@
             <w:gridSpan w:val="3"/>
           </w:tcPr>
           <w:p>
-            <w:r>
-              <w:t>Power Point</w:t>
-              <w:br/>
-              <w:t>Perangkat Komputer / Screen</w:t>
-            </w:r>
+            <w:pPr>
+              <w:pBdr>
+                <w:top w:val="nil"/>
+                <w:left w:val="nil"/>
+                <w:bottom w:val="nil"/>
+                <w:right w:val="nil"/>
+                <w:between w:val="nil"/>
+              </w:pBdr>
+              <w:spacing w:before="60" w:line="276" w:lineRule="auto"/>
+              <w:ind w:left="253" w:right="89"/>
+              <w:rPr>
+                <w:rFonts w:ascii="Tahoma" w:eastAsia="Tahoma" w:hAnsi="Tahoma" w:cs="Tahoma"/>
+                <w:color w:val="000000"/>
+                <w:sz w:val="22"/>
+                <w:szCs w:val="22"/>
+              </w:rPr>
+            </w:pPr>
           </w:p>
         </w:tc>
         <w:tc>
@@ -1088,9 +1682,15 @@
             <w:tcW w:w="1850" w:type="dxa"/>
           </w:tcPr>
           <w:p>
-            <w:r>
-              <w:t>35 menit</w:t>
-            </w:r>
+            <w:pPr>
+              <w:spacing w:before="60"/>
+              <w:jc w:val="center"/>
+              <w:rPr>
+                <w:rFonts w:ascii="Tahoma" w:eastAsia="Tahoma" w:hAnsi="Tahoma" w:cs="Tahoma"/>
+                <w:sz w:val="22"/>
+                <w:szCs w:val="22"/>
+              </w:rPr>
+            </w:pPr>
           </w:p>
         </w:tc>
       </w:tr>
@@ -1106,8 +1706,25 @@
             <w:gridSpan w:val="3"/>
           </w:tcPr>
           <w:p>
+            <w:pPr>
+              <w:pStyle w:val="ListParagraph"/>
+              <w:numPr>
+                <w:ilvl w:val="3"/>
+                <w:numId w:val="5"/>
+              </w:numPr>
+              <w:spacing w:before="60"/>
+              <w:ind w:left="292"/>
+              <w:rPr>
+                <w:rFonts w:ascii="Tahoma" w:eastAsia="Tahoma" w:hAnsi="Tahoma" w:cs="Tahoma"/>
+                <w:b/>
+              </w:rPr>
+            </w:pPr>
             <w:r>
-              <w:t>Praktik Checking &amp; Exporting (Pre-flighting)</w:t>
+              <w:rPr>
+                <w:rFonts w:ascii="Tahoma" w:eastAsia="Tahoma" w:hAnsi="Tahoma" w:cs="Tahoma"/>
+                <w:b/>
+              </w:rPr>
+              <w:t>Batasan dan Etika dalam menggunakan AI</w:t>
             </w:r>
           </w:p>
         </w:tc>
@@ -1117,17 +1734,27 @@
             <w:gridSpan w:val="2"/>
           </w:tcPr>
           <w:p>
-            <w:r>
-              <w:t>Instruktur memberikan jobsheet dan mendampingi peserta untuk:</w:t>
-              <w:br/>
-              <w:t>- Melakukan pengecekan resolusi, bleed area 3mm, dan color mode pada karya masing-masing</w:t>
-              <w:br/>
-              <w:t>- Melakukan convert font menjadi vector (Create Outlines)</w:t>
-              <w:br/>
-              <w:t>- Melakukan export PDF High Quality Print &amp; web image</w:t>
-              <w:br/>
-              <w:t>Instruktur berkeliling memberikan pendampingan dan umpan balik kepada setiap peserta</w:t>
-            </w:r>
+            <w:pPr>
+              <w:numPr>
+                <w:ilvl w:val="0"/>
+                <w:numId w:val="4"/>
+              </w:numPr>
+              <w:pBdr>
+                <w:top w:val="nil"/>
+                <w:left w:val="nil"/>
+                <w:bottom w:val="nil"/>
+                <w:right w:val="nil"/>
+                <w:between w:val="nil"/>
+              </w:pBdr>
+              <w:spacing w:before="60" w:line="276" w:lineRule="auto"/>
+              <w:ind w:left="171" w:right="89" w:hanging="283"/>
+              <w:rPr>
+                <w:rFonts w:ascii="Tahoma" w:eastAsia="Tahoma" w:hAnsi="Tahoma" w:cs="Tahoma"/>
+                <w:color w:val="000000"/>
+                <w:sz w:val="22"/>
+                <w:szCs w:val="22"/>
+              </w:rPr>
+            </w:pPr>
           </w:p>
         </w:tc>
         <w:tc>
@@ -1136,11 +1763,23 @@
             <w:gridSpan w:val="3"/>
           </w:tcPr>
           <w:p>
-            <w:r>
-              <w:t>PC Lab / Workstation</w:t>
-              <w:br/>
-              <w:t>Lembar Jobsheet 15</w:t>
-            </w:r>
+            <w:pPr>
+              <w:pBdr>
+                <w:top w:val="nil"/>
+                <w:left w:val="nil"/>
+                <w:bottom w:val="nil"/>
+                <w:right w:val="nil"/>
+                <w:between w:val="nil"/>
+              </w:pBdr>
+              <w:spacing w:before="60" w:line="276" w:lineRule="auto"/>
+              <w:ind w:left="253" w:right="89"/>
+              <w:rPr>
+                <w:rFonts w:ascii="Tahoma" w:eastAsia="Tahoma" w:hAnsi="Tahoma" w:cs="Tahoma"/>
+                <w:color w:val="000000"/>
+                <w:sz w:val="22"/>
+                <w:szCs w:val="22"/>
+              </w:rPr>
+            </w:pPr>
           </w:p>
         </w:tc>
         <w:tc>
@@ -1148,9 +1787,15 @@
             <w:tcW w:w="1850" w:type="dxa"/>
           </w:tcPr>
           <w:p>
-            <w:r>
-              <w:t>35 menit</w:t>
-            </w:r>
+            <w:pPr>
+              <w:spacing w:before="60"/>
+              <w:jc w:val="center"/>
+              <w:rPr>
+                <w:rFonts w:ascii="Tahoma" w:eastAsia="Tahoma" w:hAnsi="Tahoma" w:cs="Tahoma"/>
+                <w:sz w:val="22"/>
+                <w:szCs w:val="22"/>
+              </w:rPr>
+            </w:pPr>
           </w:p>
         </w:tc>
       </w:tr>
@@ -1166,7 +1811,24 @@
             <w:gridSpan w:val="3"/>
           </w:tcPr>
           <w:p>
+            <w:pPr>
+              <w:pStyle w:val="ListParagraph"/>
+              <w:numPr>
+                <w:ilvl w:val="3"/>
+                <w:numId w:val="5"/>
+              </w:numPr>
+              <w:spacing w:before="60"/>
+              <w:ind w:left="292"/>
+              <w:rPr>
+                <w:rFonts w:ascii="Tahoma" w:eastAsia="Tahoma" w:hAnsi="Tahoma" w:cs="Tahoma"/>
+                <w:b/>
+              </w:rPr>
+            </w:pPr>
             <w:r>
+              <w:rPr>
+                <w:rFonts w:ascii="Tahoma" w:eastAsia="Tahoma" w:hAnsi="Tahoma" w:cs="Tahoma"/>
+                <w:b/>
+              </w:rPr>
               <w:t>Kesimpulan ( Summary)</w:t>
             </w:r>
           </w:p>
@@ -1177,9 +1839,27 @@
             <w:gridSpan w:val="2"/>
           </w:tcPr>
           <w:p>
-            <w:r>
-              <w:t>Instruktur menyimpulkan tentang 3 poin krusial final artwork (Color Mode, Bleed, Resolution) dan pentingnya pre-flighting sebelum kirim ke percetakan</w:t>
-            </w:r>
+            <w:pPr>
+              <w:numPr>
+                <w:ilvl w:val="0"/>
+                <w:numId w:val="4"/>
+              </w:numPr>
+              <w:pBdr>
+                <w:top w:val="nil"/>
+                <w:left w:val="nil"/>
+                <w:bottom w:val="nil"/>
+                <w:right w:val="nil"/>
+                <w:between w:val="nil"/>
+              </w:pBdr>
+              <w:spacing w:before="60" w:line="276" w:lineRule="auto"/>
+              <w:ind w:left="171" w:right="89" w:hanging="283"/>
+              <w:rPr>
+                <w:rFonts w:ascii="Tahoma" w:eastAsia="Tahoma" w:hAnsi="Tahoma" w:cs="Tahoma"/>
+                <w:color w:val="000000"/>
+                <w:sz w:val="22"/>
+                <w:szCs w:val="22"/>
+              </w:rPr>
+            </w:pPr>
           </w:p>
         </w:tc>
         <w:tc>
@@ -1188,9 +1868,23 @@
             <w:gridSpan w:val="3"/>
           </w:tcPr>
           <w:p>
-            <w:r>
-              <w:t>Power Point</w:t>
-            </w:r>
+            <w:pPr>
+              <w:pBdr>
+                <w:top w:val="nil"/>
+                <w:left w:val="nil"/>
+                <w:bottom w:val="nil"/>
+                <w:right w:val="nil"/>
+                <w:between w:val="nil"/>
+              </w:pBdr>
+              <w:spacing w:before="60" w:line="276" w:lineRule="auto"/>
+              <w:ind w:left="253" w:right="89"/>
+              <w:rPr>
+                <w:rFonts w:ascii="Tahoma" w:eastAsia="Tahoma" w:hAnsi="Tahoma" w:cs="Tahoma"/>
+                <w:color w:val="000000"/>
+                <w:sz w:val="22"/>
+                <w:szCs w:val="22"/>
+              </w:rPr>
+            </w:pPr>
           </w:p>
         </w:tc>
         <w:tc>
@@ -1198,9 +1892,15 @@
             <w:tcW w:w="1850" w:type="dxa"/>
           </w:tcPr>
           <w:p>
-            <w:r>
-              <w:t>5 menit</w:t>
-            </w:r>
+            <w:pPr>
+              <w:spacing w:before="60"/>
+              <w:jc w:val="center"/>
+              <w:rPr>
+                <w:rFonts w:ascii="Tahoma" w:eastAsia="Tahoma" w:hAnsi="Tahoma" w:cs="Tahoma"/>
+                <w:sz w:val="22"/>
+                <w:szCs w:val="22"/>
+              </w:rPr>
+            </w:pPr>
           </w:p>
         </w:tc>
       </w:tr>
@@ -1217,7 +1917,25 @@
             <w:vAlign w:val="center"/>
           </w:tcPr>
           <w:p>
+            <w:pPr>
+              <w:pStyle w:val="ListParagraph"/>
+              <w:numPr>
+                <w:ilvl w:val="0"/>
+                <w:numId w:val="6"/>
+              </w:numPr>
+              <w:spacing w:before="120" w:after="120"/>
+              <w:ind w:left="436" w:hanging="426"/>
+              <w:jc w:val="both"/>
+              <w:rPr>
+                <w:rFonts w:ascii="Tahoma" w:eastAsia="Tahoma" w:hAnsi="Tahoma" w:cs="Tahoma"/>
+                <w:b/>
+              </w:rPr>
+            </w:pPr>
             <w:r>
+              <w:rPr>
+                <w:rFonts w:ascii="Tahoma" w:eastAsia="Tahoma" w:hAnsi="Tahoma" w:cs="Tahoma"/>
+                <w:b/>
+              </w:rPr>
               <w:t>Aplikasi</w:t>
             </w:r>
           </w:p>
@@ -1228,163 +1946,27 @@
             <w:gridSpan w:val="2"/>
           </w:tcPr>
           <w:p>
-            <w:r>
-              <w:t>Instruktur memberikan pertanyaan kepada peserta menggunakan Quizizz/Form untuk mengukur pemahaman peserta terhadap spesifikasi file siap cetak</w:t>
-            </w:r>
-          </w:p>
-        </w:tc>
-        <w:tc>
-          <w:tcPr>
-            <w:tcW w:w="1796" w:type="dxa"/>
-            <w:gridSpan w:val="3"/>
-          </w:tcPr>
-          <w:p>
-            <w:r>
-              <w:t>Quizizz.com / Form</w:t>
-            </w:r>
-          </w:p>
-        </w:tc>
-        <w:tc>
-          <w:tcPr>
-            <w:tcW w:w="1850" w:type="dxa"/>
-          </w:tcPr>
-          <w:p>
-            <w:r>
-              <w:t>20 menit</w:t>
-            </w:r>
-          </w:p>
-        </w:tc>
-      </w:tr>
-      <w:tr>
-        <w:trPr>
-          <w:gridAfter w:val="1"/>
-          <w:wAfter w:w="10" w:type="dxa"/>
-          <w:trHeight w:val="306"/>
-        </w:trPr>
-        <w:tc>
-          <w:tcPr>
-            <w:tcW w:w="2665" w:type="dxa"/>
-            <w:gridSpan w:val="3"/>
-            <w:vAlign w:val="center"/>
-          </w:tcPr>
-          <w:p>
-            <w:r>
-              <w:t>Evaluasi</w:t>
-            </w:r>
-          </w:p>
-        </w:tc>
-        <w:tc>
-          <w:tcPr>
-            <w:tcW w:w="3543" w:type="dxa"/>
-            <w:gridSpan w:val="2"/>
-          </w:tcPr>
-          <w:p>
-            <w:r>
-              <w:t>Instruktur membagikan lembar evaluasi/jobsheet 15 kepada peserta pelatihan untuk menilai hasil export file</w:t>
-            </w:r>
-          </w:p>
-        </w:tc>
-        <w:tc>
-          <w:tcPr>
-            <w:tcW w:w="1796" w:type="dxa"/>
-            <w:gridSpan w:val="3"/>
-          </w:tcPr>
-          <w:p>
-            <w:r>
-              <w:t>Lembar Jobsheet 15 &amp; Rubrik</w:t>
-            </w:r>
-          </w:p>
-        </w:tc>
-        <w:tc>
-          <w:tcPr>
-            <w:tcW w:w="1850" w:type="dxa"/>
-          </w:tcPr>
-          <w:p>
-            <w:r>
-              <w:t>30 menit</w:t>
-            </w:r>
-          </w:p>
-        </w:tc>
-      </w:tr>
-      <w:tr>
-        <w:trPr>
-          <w:gridAfter w:val="1"/>
-          <w:wAfter w:w="10" w:type="dxa"/>
-          <w:trHeight w:val="587"/>
-        </w:trPr>
-        <w:tc>
-          <w:tcPr>
-            <w:tcW w:w="2665" w:type="dxa"/>
-            <w:gridSpan w:val="3"/>
-            <w:vAlign w:val="center"/>
-          </w:tcPr>
-          <w:p>
-            <w:r>
-              <w:t>Tugas Tambahan</w:t>
-            </w:r>
-          </w:p>
-        </w:tc>
-        <w:tc>
-          <w:tcPr>
-            <w:tcW w:w="3543" w:type="dxa"/>
-            <w:gridSpan w:val="2"/>
-          </w:tcPr>
-          <w:p>
-            <w:r>
-              <w:t>Instruktur memberikan tugas tambahan kepada peserta pelatihan untuk pekerjaan rumah: Upload file final artwork (PDF cetak &amp; PNG digital) ke folder GitHub/Drive, dikumpulkan esok hari</w:t>
-            </w:r>
-          </w:p>
-        </w:tc>
-        <w:tc>
-          <w:tcPr>
-            <w:tcW w:w="1796" w:type="dxa"/>
-            <w:gridSpan w:val="3"/>
-          </w:tcPr>
-          <w:p>
-            <w:r>
-              <w:t>Upload File Artwork ke Drive/GitHub (Tugas PR)</w:t>
-            </w:r>
-          </w:p>
-        </w:tc>
-        <w:tc>
-          <w:tcPr>
-            <w:tcW w:w="1850" w:type="dxa"/>
-          </w:tcPr>
-          <w:p>
-            <w:r>
-              <w:t>5 menit</w:t>
-            </w:r>
-          </w:p>
-        </w:tc>
-      </w:tr>
-      <w:tr>
-        <w:trPr>
-          <w:gridAfter w:val="1"/>
-          <w:wAfter w:w="10" w:type="dxa"/>
-        </w:trPr>
-        <w:tc>
-          <w:tcPr>
-            <w:tcW w:w="2665" w:type="dxa"/>
-            <w:gridSpan w:val="3"/>
-            <w:vAlign w:val="center"/>
-          </w:tcPr>
-          <w:p>
-            <w:r>
-              <w:t>Pemberesan Kelas</w:t>
-            </w:r>
-          </w:p>
-        </w:tc>
-        <w:tc>
-          <w:tcPr>
-            <w:tcW w:w="3543" w:type="dxa"/>
-            <w:gridSpan w:val="2"/>
-          </w:tcPr>
-          <w:p>
-            <w:r>
-              <w:t>Merapikan Ruang kelas &amp; PC</w:t>
-              <w:br/>
-              <w:t>Berdoa dan memberikan salam</w:t>
-            </w:r>
+            <w:pPr>
+              <w:numPr>
+                <w:ilvl w:val="0"/>
+                <w:numId w:val="4"/>
+              </w:numPr>
+              <w:pBdr>
+                <w:top w:val="nil"/>
+                <w:left w:val="nil"/>
+                <w:bottom w:val="nil"/>
+                <w:right w:val="nil"/>
+                <w:between w:val="nil"/>
+              </w:pBdr>
+              <w:spacing w:before="60" w:line="276" w:lineRule="auto"/>
+              <w:ind w:left="201" w:right="89" w:hanging="283"/>
+              <w:rPr>
+                <w:rFonts w:ascii="Tahoma" w:eastAsia="Tahoma" w:hAnsi="Tahoma" w:cs="Tahoma"/>
+                <w:color w:val="000000"/>
+                <w:sz w:val="22"/>
+                <w:szCs w:val="22"/>
+              </w:rPr>
+            </w:pPr>
           </w:p>
         </w:tc>
         <w:tc>
@@ -1421,9 +2003,367 @@
             <w:tcW w:w="1850" w:type="dxa"/>
           </w:tcPr>
           <w:p>
+            <w:pPr>
+              <w:pBdr>
+                <w:top w:val="nil"/>
+                <w:left w:val="nil"/>
+                <w:bottom w:val="nil"/>
+                <w:right w:val="nil"/>
+                <w:between w:val="nil"/>
+              </w:pBdr>
+              <w:spacing w:before="60"/>
+              <w:jc w:val="center"/>
+              <w:rPr>
+                <w:rFonts w:ascii="Tahoma" w:eastAsia="Tahoma" w:hAnsi="Tahoma" w:cs="Tahoma"/>
+                <w:sz w:val="22"/>
+                <w:szCs w:val="22"/>
+              </w:rPr>
+            </w:pPr>
+          </w:p>
+        </w:tc>
+      </w:tr>
+      <w:tr>
+        <w:trPr>
+          <w:gridAfter w:val="1"/>
+          <w:wAfter w:w="10" w:type="dxa"/>
+          <w:trHeight w:val="306"/>
+        </w:trPr>
+        <w:tc>
+          <w:tcPr>
+            <w:tcW w:w="2665" w:type="dxa"/>
+            <w:gridSpan w:val="3"/>
+            <w:vAlign w:val="center"/>
+          </w:tcPr>
+          <w:p>
+            <w:pPr>
+              <w:pStyle w:val="ListParagraph"/>
+              <w:numPr>
+                <w:ilvl w:val="0"/>
+                <w:numId w:val="6"/>
+              </w:numPr>
+              <w:spacing w:before="120" w:after="120"/>
+              <w:ind w:left="436" w:hanging="426"/>
+              <w:jc w:val="both"/>
+              <w:rPr>
+                <w:rFonts w:ascii="Tahoma" w:eastAsia="Tahoma" w:hAnsi="Tahoma" w:cs="Tahoma"/>
+                <w:b/>
+              </w:rPr>
+            </w:pPr>
             <w:r>
-              <w:t>5 menit</w:t>
+              <w:rPr>
+                <w:rFonts w:ascii="Tahoma" w:eastAsia="Tahoma" w:hAnsi="Tahoma" w:cs="Tahoma"/>
+                <w:b/>
+              </w:rPr>
+              <w:t>Evaluasi</w:t>
             </w:r>
+          </w:p>
+        </w:tc>
+        <w:tc>
+          <w:tcPr>
+            <w:tcW w:w="3543" w:type="dxa"/>
+            <w:gridSpan w:val="2"/>
+          </w:tcPr>
+          <w:p>
+            <w:pPr>
+              <w:numPr>
+                <w:ilvl w:val="0"/>
+                <w:numId w:val="4"/>
+              </w:numPr>
+              <w:pBdr>
+                <w:top w:val="nil"/>
+                <w:left w:val="nil"/>
+                <w:bottom w:val="nil"/>
+                <w:right w:val="nil"/>
+                <w:between w:val="nil"/>
+              </w:pBdr>
+              <w:spacing w:before="60" w:line="276" w:lineRule="auto"/>
+              <w:ind w:left="201" w:right="89" w:hanging="335"/>
+              <w:rPr>
+                <w:rFonts w:ascii="Tahoma" w:eastAsia="Tahoma" w:hAnsi="Tahoma" w:cs="Tahoma"/>
+                <w:color w:val="000000"/>
+                <w:sz w:val="22"/>
+                <w:szCs w:val="22"/>
+              </w:rPr>
+            </w:pPr>
+          </w:p>
+        </w:tc>
+        <w:tc>
+          <w:tcPr>
+            <w:tcW w:w="1796" w:type="dxa"/>
+            <w:gridSpan w:val="3"/>
+          </w:tcPr>
+          <w:p>
+            <w:pPr>
+              <w:numPr>
+                <w:ilvl w:val="0"/>
+                <w:numId w:val="4"/>
+              </w:numPr>
+              <w:pBdr>
+                <w:top w:val="nil"/>
+                <w:left w:val="nil"/>
+                <w:bottom w:val="nil"/>
+                <w:right w:val="nil"/>
+                <w:between w:val="nil"/>
+              </w:pBdr>
+              <w:spacing w:before="60" w:line="276" w:lineRule="auto"/>
+              <w:ind w:left="253" w:right="89" w:hanging="220"/>
+              <w:rPr>
+                <w:rFonts w:ascii="Tahoma" w:eastAsia="Tahoma" w:hAnsi="Tahoma" w:cs="Tahoma"/>
+                <w:color w:val="000000"/>
+                <w:sz w:val="22"/>
+                <w:szCs w:val="22"/>
+              </w:rPr>
+            </w:pPr>
+          </w:p>
+        </w:tc>
+        <w:tc>
+          <w:tcPr>
+            <w:tcW w:w="1850" w:type="dxa"/>
+          </w:tcPr>
+          <w:p>
+            <w:pPr>
+              <w:pBdr>
+                <w:top w:val="nil"/>
+                <w:left w:val="nil"/>
+                <w:bottom w:val="nil"/>
+                <w:right w:val="nil"/>
+                <w:between w:val="nil"/>
+              </w:pBdr>
+              <w:spacing w:before="60"/>
+              <w:jc w:val="center"/>
+              <w:rPr>
+                <w:rFonts w:ascii="Tahoma" w:eastAsia="Tahoma" w:hAnsi="Tahoma" w:cs="Tahoma"/>
+                <w:sz w:val="22"/>
+                <w:szCs w:val="22"/>
+              </w:rPr>
+            </w:pPr>
+          </w:p>
+        </w:tc>
+      </w:tr>
+      <w:tr>
+        <w:trPr>
+          <w:gridAfter w:val="1"/>
+          <w:wAfter w:w="10" w:type="dxa"/>
+          <w:trHeight w:val="587"/>
+        </w:trPr>
+        <w:tc>
+          <w:tcPr>
+            <w:tcW w:w="2665" w:type="dxa"/>
+            <w:gridSpan w:val="3"/>
+            <w:vAlign w:val="center"/>
+          </w:tcPr>
+          <w:p>
+            <w:pPr>
+              <w:spacing w:before="120" w:after="120"/>
+              <w:jc w:val="both"/>
+              <w:rPr>
+                <w:rFonts w:ascii="Tahoma" w:eastAsia="Tahoma" w:hAnsi="Tahoma" w:cs="Tahoma"/>
+                <w:b/>
+                <w:sz w:val="22"/>
+                <w:szCs w:val="22"/>
+              </w:rPr>
+            </w:pPr>
+            <w:r>
+              <w:rPr>
+                <w:rFonts w:ascii="Tahoma" w:eastAsia="Tahoma" w:hAnsi="Tahoma" w:cs="Tahoma"/>
+                <w:b/>
+                <w:sz w:val="22"/>
+                <w:szCs w:val="22"/>
+              </w:rPr>
+              <w:t>Tugas Tambahan</w:t>
+            </w:r>
+          </w:p>
+        </w:tc>
+        <w:tc>
+          <w:tcPr>
+            <w:tcW w:w="3543" w:type="dxa"/>
+            <w:gridSpan w:val="2"/>
+          </w:tcPr>
+          <w:p>
+            <w:pPr>
+              <w:numPr>
+                <w:ilvl w:val="0"/>
+                <w:numId w:val="4"/>
+              </w:numPr>
+              <w:pBdr>
+                <w:top w:val="nil"/>
+                <w:left w:val="nil"/>
+                <w:bottom w:val="nil"/>
+                <w:right w:val="nil"/>
+                <w:between w:val="nil"/>
+              </w:pBdr>
+              <w:spacing w:before="60" w:line="276" w:lineRule="auto"/>
+              <w:ind w:left="253" w:right="89" w:hanging="220"/>
+              <w:rPr>
+                <w:rFonts w:ascii="Tahoma" w:eastAsia="Tahoma" w:hAnsi="Tahoma" w:cs="Tahoma"/>
+                <w:color w:val="000000"/>
+                <w:sz w:val="22"/>
+                <w:szCs w:val="22"/>
+              </w:rPr>
+            </w:pPr>
+          </w:p>
+        </w:tc>
+        <w:tc>
+          <w:tcPr>
+            <w:tcW w:w="1796" w:type="dxa"/>
+            <w:gridSpan w:val="3"/>
+          </w:tcPr>
+          <w:p>
+            <w:pPr>
+              <w:pBdr>
+                <w:top w:val="nil"/>
+                <w:left w:val="nil"/>
+                <w:bottom w:val="nil"/>
+                <w:right w:val="nil"/>
+                <w:between w:val="nil"/>
+              </w:pBdr>
+              <w:spacing w:before="60" w:line="276" w:lineRule="auto"/>
+              <w:ind w:left="33" w:right="89"/>
+              <w:rPr>
+                <w:rFonts w:ascii="Tahoma" w:eastAsia="Tahoma" w:hAnsi="Tahoma" w:cs="Tahoma"/>
+                <w:color w:val="000000"/>
+                <w:sz w:val="22"/>
+                <w:szCs w:val="22"/>
+              </w:rPr>
+            </w:pPr>
+          </w:p>
+        </w:tc>
+        <w:tc>
+          <w:tcPr>
+            <w:tcW w:w="1850" w:type="dxa"/>
+          </w:tcPr>
+          <w:p>
+            <w:pPr>
+              <w:pBdr>
+                <w:top w:val="nil"/>
+                <w:left w:val="nil"/>
+                <w:bottom w:val="nil"/>
+                <w:right w:val="nil"/>
+                <w:between w:val="nil"/>
+              </w:pBdr>
+              <w:spacing w:before="60"/>
+              <w:jc w:val="center"/>
+              <w:rPr>
+                <w:rFonts w:ascii="Tahoma" w:eastAsia="Tahoma" w:hAnsi="Tahoma" w:cs="Tahoma"/>
+                <w:sz w:val="22"/>
+                <w:szCs w:val="22"/>
+              </w:rPr>
+            </w:pPr>
+          </w:p>
+        </w:tc>
+      </w:tr>
+      <w:tr>
+        <w:trPr>
+          <w:gridAfter w:val="1"/>
+          <w:wAfter w:w="10" w:type="dxa"/>
+        </w:trPr>
+        <w:tc>
+          <w:tcPr>
+            <w:tcW w:w="2665" w:type="dxa"/>
+            <w:gridSpan w:val="3"/>
+            <w:vAlign w:val="center"/>
+          </w:tcPr>
+          <w:p>
+            <w:pPr>
+              <w:spacing w:before="120" w:after="120"/>
+              <w:jc w:val="both"/>
+              <w:rPr>
+                <w:rFonts w:ascii="Tahoma" w:eastAsia="Tahoma" w:hAnsi="Tahoma" w:cs="Tahoma"/>
+                <w:b/>
+                <w:sz w:val="22"/>
+                <w:szCs w:val="22"/>
+              </w:rPr>
+            </w:pPr>
+            <w:r>
+              <w:rPr>
+                <w:rFonts w:ascii="Tahoma" w:eastAsia="Tahoma" w:hAnsi="Tahoma" w:cs="Tahoma"/>
+                <w:b/>
+                <w:sz w:val="22"/>
+                <w:szCs w:val="22"/>
+              </w:rPr>
+              <w:t>Pemberesan Kelas</w:t>
+            </w:r>
+          </w:p>
+        </w:tc>
+        <w:tc>
+          <w:tcPr>
+            <w:tcW w:w="3543" w:type="dxa"/>
+            <w:gridSpan w:val="2"/>
+          </w:tcPr>
+          <w:p>
+            <w:pPr>
+              <w:numPr>
+                <w:ilvl w:val="0"/>
+                <w:numId w:val="4"/>
+              </w:numPr>
+              <w:pBdr>
+                <w:top w:val="nil"/>
+                <w:left w:val="nil"/>
+                <w:bottom w:val="nil"/>
+                <w:right w:val="nil"/>
+                <w:between w:val="nil"/>
+              </w:pBdr>
+              <w:spacing w:before="60" w:line="276" w:lineRule="auto"/>
+              <w:ind w:left="253" w:right="89" w:hanging="220"/>
+              <w:rPr>
+                <w:rFonts w:ascii="Tahoma" w:eastAsia="Tahoma" w:hAnsi="Tahoma" w:cs="Tahoma"/>
+                <w:color w:val="000000"/>
+                <w:sz w:val="22"/>
+                <w:szCs w:val="22"/>
+              </w:rPr>
+            </w:pPr>
+          </w:p>
+        </w:tc>
+        <w:tc>
+          <w:tcPr>
+            <w:tcW w:w="1796" w:type="dxa"/>
+            <w:gridSpan w:val="3"/>
+          </w:tcPr>
+          <w:p>
+            <w:pPr>
+              <w:numPr>
+                <w:ilvl w:val="0"/>
+                <w:numId w:val="4"/>
+              </w:numPr>
+              <w:pBdr>
+                <w:top w:val="nil"/>
+                <w:left w:val="nil"/>
+                <w:bottom w:val="nil"/>
+                <w:right w:val="nil"/>
+                <w:between w:val="nil"/>
+              </w:pBdr>
+              <w:spacing w:before="60" w:line="276" w:lineRule="auto"/>
+              <w:ind w:left="253" w:right="89" w:hanging="220"/>
+              <w:rPr>
+                <w:rFonts w:ascii="Tahoma" w:eastAsia="Tahoma" w:hAnsi="Tahoma" w:cs="Tahoma"/>
+                <w:color w:val="000000"/>
+                <w:sz w:val="22"/>
+                <w:szCs w:val="22"/>
+              </w:rPr>
+            </w:pPr>
+          </w:p>
+        </w:tc>
+        <w:tc>
+          <w:tcPr>
+            <w:tcW w:w="1850" w:type="dxa"/>
+          </w:tcPr>
+          <w:p>
+            <w:pPr>
+              <w:pBdr>
+                <w:top w:val="nil"/>
+                <w:left w:val="nil"/>
+                <w:bottom w:val="nil"/>
+                <w:right w:val="nil"/>
+                <w:between w:val="nil"/>
+              </w:pBdr>
+              <w:spacing w:before="60"/>
+              <w:jc w:val="center"/>
+              <w:rPr>
+                <w:rFonts w:ascii="Tahoma" w:eastAsia="Tahoma" w:hAnsi="Tahoma" w:cs="Tahoma"/>
+                <w:sz w:val="22"/>
+                <w:szCs w:val="22"/>
+              </w:rPr>
+            </w:pPr>
           </w:p>
         </w:tc>
       </w:tr>

</xml_diff>